<commit_message>
chore: sync template refinement and docx research
</commit_message>
<xml_diff>
--- a/03-项目课题/26.0618-数智化生产支撑系统(JBFG)/20-解决方案/模板体系/JBFG-技术方案版样张.docx
+++ b/03-项目课题/26.0618-数智化生产支撑系统(JBFG)/20-解决方案/模板体系/JBFG-技术方案版样张.docx
@@ -4,8 +4,8 @@
   <w:body>
     <w:p>
       <w:pPr>
+        <w:shd w:fill="1B3A5C" w:val="clear"/>
         <w:spacing w:before="0" w:after="0"/>
-        <w:shd w:fill="1B3A5C" w:val="clear"/>
       </w:pPr>
       <w:r>
         <w:rPr>
@@ -68,11 +68,6 @@
         <w:spacing w:before="240" w:after="240"/>
         <w:jc w:val="center"/>
       </w:pPr>
-    </w:p>
-    <w:p>
-      <w:pPr>
-        <w:jc w:val="center"/>
-      </w:pPr>
       <w:r>
         <w:rPr>
           <w:rFonts w:ascii="Times New Roman" w:hAnsi="Times New Roman" w:eastAsia="宋体"/>
@@ -115,8 +110,8 @@
     </w:p>
     <w:p>
       <w:pPr>
+        <w:shd w:fill="1B3A5C" w:val="clear"/>
         <w:spacing w:before="0" w:after="0"/>
-        <w:shd w:fill="1B3A5C" w:val="clear"/>
       </w:pPr>
       <w:r>
         <w:rPr>
@@ -150,6 +145,16 @@
     </w:p>
     <w:p>
       <w:pPr>
+        <w:sectPr>
+          <w:pgSz w:w="11906" w:h="16838"/>
+          <w:pgMar w:top="1440" w:right="1797" w:bottom="1440" w:left="1797" w:header="850" w:footer="850" w:gutter="0"/>
+          <w:cols w:space="720"/>
+          <w:docGrid w:linePitch="360"/>
+        </w:sectPr>
+      </w:pPr>
+    </w:p>
+    <w:p>
+      <w:pPr>
         <w:pStyle w:val="Heading1"/>
       </w:pPr>
       <w:r>
@@ -162,13 +167,10 @@
       </w:r>
     </w:p>
     <w:p>
-      <w:r>
-        <w:br w:type="page"/>
-      </w:r>
-    </w:p>
-    <w:p>
       <w:pPr>
         <w:sectPr>
+          <w:headerReference w:type="default" r:id="rId9"/>
+          <w:footerReference w:type="default" r:id="rId10"/>
           <w:pgSz w:w="11906" w:h="16838"/>
           <w:pgMar w:top="1440" w:right="1797" w:bottom="1440" w:left="1797" w:header="850" w:footer="850" w:gutter="0"/>
           <w:cols w:space="720"/>
@@ -194,7 +196,7 @@
     </w:p>
     <w:p>
       <w:r>
-        <w:t>冀北风光储基地概况、新型电力系统要求、行业趋势……</w:t>
+        <w:t>冀北风光储基地概况、新型电力系统要求、数字化向数智化演进……</w:t>
       </w:r>
     </w:p>
     <w:p>
@@ -207,8 +209,83 @@
     </w:p>
     <w:p>
       <w:r>
-        <w:t>S (现状) → C (挑战) → Q (核心问题) → A (方案概要)……</w:t>
+        <w:t>S (现状) → C (三大挑战) → Q (核心问题) → A (方案概要)……</w:t>
       </w:r>
+    </w:p>
+    <w:tbl>
+      <w:tblPr>
+        <w:tblW w:type="auto" w:w="0"/>
+        <w:jc w:val="center"/>
+        <w:tblLook w:firstColumn="1" w:firstRow="1" w:lastColumn="0" w:lastRow="0" w:noHBand="0" w:noVBand="1" w:val="04A0"/>
+        <w:tblBorders>
+          <w:top w:val="dashed" w:sz="6" w:space="0" w:color="999999"/>
+          <w:bottom w:val="dashed" w:sz="6" w:space="0" w:color="999999"/>
+          <w:left w:val="dashed" w:sz="6" w:space="0" w:color="999999"/>
+          <w:right w:val="dashed" w:sz="6" w:space="0" w:color="999999"/>
+        </w:tblBorders>
+      </w:tblPr>
+      <w:tblGrid>
+        <w:gridCol w:w="8312"/>
+      </w:tblGrid>
+      <w:tr>
+        <w:trPr>
+          <w:trHeight w:val="2835" w:hRule="atLeast"/>
+        </w:trPr>
+        <w:tc>
+          <w:tcPr>
+            <w:tcW w:type="dxa" w:w="8312"/>
+            <w:shd w:fill="F5F5F5" w:val="clear"/>
+          </w:tcPr>
+          <w:p>
+            <w:pPr>
+              <w:jc w:val="center"/>
+            </w:pPr>
+            <w:r/>
+            <w:r>
+              <w:rPr>
+                <w:rFonts w:ascii="Times New Roman" w:hAnsi="Times New Roman" w:eastAsia="宋体"/>
+                <w:b w:val="0"/>
+                <w:color w:val="666666"/>
+                <w:sz w:val="22"/>
+              </w:rPr>
+              <w:br/>
+              <w:br/>
+              <w:t>[ 此处插入图片：图 1-1  系统总体架构 ]</w:t>
+              <w:br/>
+              <w:t>建议尺寸：14cm × 5cm</w:t>
+              <w:br/>
+              <w:br/>
+            </w:r>
+          </w:p>
+        </w:tc>
+      </w:tr>
+    </w:tbl>
+    <w:p>
+      <w:pPr>
+        <w:spacing w:before="60" w:after="120"/>
+        <w:jc w:val="center"/>
+      </w:pPr>
+      <w:r>
+        <w:rPr>
+          <w:rFonts w:ascii="Times New Roman" w:hAnsi="Times New Roman" w:eastAsia="宋体"/>
+          <w:b/>
+          <w:color w:val="333333"/>
+          <w:sz w:val="21"/>
+        </w:rPr>
+        <w:t>图 1-1  系统总体架构</w:t>
+      </w:r>
+    </w:p>
+    <w:p>
+      <w:pPr>
+        <w:sectPr>
+          <w:headerReference w:type="default" r:id="rId11"/>
+          <w:footerReference w:type="default" r:id="rId12"/>
+          <w:pgSz w:w="11906" w:h="16838"/>
+          <w:pgMar w:top="1440" w:right="1797" w:bottom="1440" w:left="1797" w:header="850" w:footer="850" w:gutter="0"/>
+          <w:cols w:space="720"/>
+          <w:docGrid w:linePitch="360"/>
+        </w:sectPr>
+      </w:pPr>
     </w:p>
     <w:p>
       <w:pPr>
@@ -228,9 +305,357 @@
     </w:p>
     <w:p>
       <w:r>
-        <w:t>USDF——新能源场站的空间对象操作系统……</w:t>
+        <w:t>USDF——新能源场站的空间对象操作系统。</w:t>
       </w:r>
     </w:p>
+    <w:p>
+      <w:pPr>
+        <w:spacing w:before="120" w:after="60"/>
+        <w:jc w:val="center"/>
+      </w:pPr>
+      <w:r>
+        <w:rPr>
+          <w:rFonts w:ascii="Times New Roman" w:hAnsi="Times New Roman" w:eastAsia="宋体"/>
+          <w:b/>
+          <w:color w:val="333333"/>
+          <w:sz w:val="21"/>
+        </w:rPr>
+        <w:t>表 2-1  操作系统类比</w:t>
+      </w:r>
+    </w:p>
+    <w:tbl>
+      <w:tblPr>
+        <w:tblW w:type="auto" w:w="0"/>
+        <w:jc w:val="center"/>
+        <w:tblLook w:firstColumn="1" w:firstRow="1" w:lastColumn="0" w:lastRow="0" w:noHBand="0" w:noVBand="1" w:val="04A0"/>
+        <w:tblBorders>
+          <w:top w:val="single" w:sz="12" w:space="0" w:color="1B3A5C"/>
+          <w:bottom w:val="single" w:sz="12" w:space="0" w:color="1B3A5C"/>
+          <w:left w:val="single" w:sz="12" w:space="0" w:color="1B3A5C"/>
+          <w:right w:val="single" w:sz="12" w:space="0" w:color="1B3A5C"/>
+          <w:insideH w:val="single" w:sz="4" w:space="0" w:color="CCCCCC"/>
+          <w:insideV w:val="single" w:sz="4" w:space="0" w:color="CCCCCC"/>
+        </w:tblBorders>
+      </w:tblPr>
+      <w:tblGrid>
+        <w:gridCol w:w="302400"/>
+        <w:gridCol w:w="302400"/>
+        <w:gridCol w:w="302400"/>
+      </w:tblGrid>
+      <w:tr>
+        <w:tc>
+          <w:tcPr>
+            <w:tcW w:type="dxa" w:w="2771"/>
+            <w:shd w:fill="4D4D4D" w:val="clear"/>
+          </w:tcPr>
+          <w:p>
+            <w:pPr>
+              <w:jc w:val="center"/>
+            </w:pPr>
+            <w:r/>
+            <w:r>
+              <w:rPr>
+                <w:rFonts w:ascii="Times New Roman" w:hAnsi="Times New Roman" w:eastAsia="宋体"/>
+                <w:b/>
+                <w:color w:val="FFFFFF"/>
+                <w:sz w:val="21"/>
+              </w:rPr>
+              <w:t>OS 概念</w:t>
+            </w:r>
+          </w:p>
+        </w:tc>
+        <w:tc>
+          <w:tcPr>
+            <w:tcW w:type="dxa" w:w="2771"/>
+            <w:shd w:fill="4D4D4D" w:val="clear"/>
+          </w:tcPr>
+          <w:p>
+            <w:pPr>
+              <w:jc w:val="center"/>
+            </w:pPr>
+            <w:r/>
+            <w:r>
+              <w:rPr>
+                <w:rFonts w:ascii="Times New Roman" w:hAnsi="Times New Roman" w:eastAsia="宋体"/>
+                <w:b/>
+                <w:color w:val="FFFFFF"/>
+                <w:sz w:val="21"/>
+              </w:rPr>
+              <w:t>USDF 对应</w:t>
+            </w:r>
+          </w:p>
+        </w:tc>
+        <w:tc>
+          <w:tcPr>
+            <w:tcW w:type="dxa" w:w="2771"/>
+            <w:shd w:fill="4D4D4D" w:val="clear"/>
+          </w:tcPr>
+          <w:p>
+            <w:pPr>
+              <w:jc w:val="center"/>
+            </w:pPr>
+            <w:r/>
+            <w:r>
+              <w:rPr>
+                <w:rFonts w:ascii="Times New Roman" w:hAnsi="Times New Roman" w:eastAsia="宋体"/>
+                <w:b/>
+                <w:color w:val="FFFFFF"/>
+                <w:sz w:val="21"/>
+              </w:rPr>
+              <w:t>工程含义</w:t>
+            </w:r>
+          </w:p>
+        </w:tc>
+      </w:tr>
+      <w:tr>
+        <w:tc>
+          <w:tcPr>
+            <w:tcW w:type="dxa" w:w="2771"/>
+          </w:tcPr>
+          <w:p>
+            <w:pPr>
+              <w:jc w:val="center"/>
+            </w:pPr>
+            <w:r/>
+            <w:r>
+              <w:rPr>
+                <w:rFonts w:ascii="Times New Roman" w:hAnsi="Times New Roman" w:eastAsia="宋体"/>
+                <w:b w:val="0"/>
+                <w:color w:val="333333"/>
+                <w:sz w:val="21"/>
+              </w:rPr>
+              <w:t>文件系统</w:t>
+            </w:r>
+          </w:p>
+        </w:tc>
+        <w:tc>
+          <w:tcPr>
+            <w:tcW w:type="dxa" w:w="2771"/>
+          </w:tcPr>
+          <w:p>
+            <w:pPr>
+              <w:jc w:val="center"/>
+            </w:pPr>
+            <w:r/>
+            <w:r>
+              <w:rPr>
+                <w:rFonts w:ascii="Times New Roman" w:hAnsi="Times New Roman" w:eastAsia="宋体"/>
+                <w:b w:val="0"/>
+                <w:color w:val="333333"/>
+                <w:sz w:val="21"/>
+              </w:rPr>
+              <w:t>空间对象注册</w:t>
+            </w:r>
+          </w:p>
+        </w:tc>
+        <w:tc>
+          <w:tcPr>
+            <w:tcW w:type="dxa" w:w="2771"/>
+          </w:tcPr>
+          <w:p>
+            <w:pPr>
+              <w:jc w:val="center"/>
+            </w:pPr>
+            <w:r/>
+            <w:r>
+              <w:rPr>
+                <w:rFonts w:ascii="Times New Roman" w:hAnsi="Times New Roman" w:eastAsia="宋体"/>
+                <w:b w:val="0"/>
+                <w:color w:val="333333"/>
+                <w:sz w:val="21"/>
+              </w:rPr>
+              <w:t>全局唯一 ID + 空间坐标</w:t>
+            </w:r>
+          </w:p>
+        </w:tc>
+      </w:tr>
+      <w:tr>
+        <w:tc>
+          <w:tcPr>
+            <w:tcW w:type="dxa" w:w="2771"/>
+          </w:tcPr>
+          <w:p>
+            <w:pPr>
+              <w:jc w:val="center"/>
+            </w:pPr>
+            <w:r/>
+            <w:r>
+              <w:rPr>
+                <w:rFonts w:ascii="Times New Roman" w:hAnsi="Times New Roman" w:eastAsia="宋体"/>
+                <w:b w:val="0"/>
+                <w:color w:val="333333"/>
+                <w:sz w:val="21"/>
+              </w:rPr>
+              <w:t>设备驱动</w:t>
+            </w:r>
+          </w:p>
+        </w:tc>
+        <w:tc>
+          <w:tcPr>
+            <w:tcW w:type="dxa" w:w="2771"/>
+          </w:tcPr>
+          <w:p>
+            <w:pPr>
+              <w:jc w:val="center"/>
+            </w:pPr>
+            <w:r/>
+            <w:r>
+              <w:rPr>
+                <w:rFonts w:ascii="Times New Roman" w:hAnsi="Times New Roman" w:eastAsia="宋体"/>
+                <w:b w:val="0"/>
+                <w:color w:val="333333"/>
+                <w:sz w:val="21"/>
+              </w:rPr>
+              <w:t>统一采集适配器</w:t>
+            </w:r>
+          </w:p>
+        </w:tc>
+        <w:tc>
+          <w:tcPr>
+            <w:tcW w:type="dxa" w:w="2771"/>
+          </w:tcPr>
+          <w:p>
+            <w:pPr>
+              <w:jc w:val="center"/>
+            </w:pPr>
+            <w:r/>
+            <w:r>
+              <w:rPr>
+                <w:rFonts w:ascii="Times New Roman" w:hAnsi="Times New Roman" w:eastAsia="宋体"/>
+                <w:b w:val="0"/>
+                <w:color w:val="333333"/>
+                <w:sz w:val="21"/>
+              </w:rPr>
+              <w:t>多协议→统一格式</w:t>
+            </w:r>
+          </w:p>
+        </w:tc>
+      </w:tr>
+      <w:tr>
+        <w:tc>
+          <w:tcPr>
+            <w:tcW w:type="dxa" w:w="2771"/>
+          </w:tcPr>
+          <w:p>
+            <w:pPr>
+              <w:jc w:val="center"/>
+            </w:pPr>
+            <w:r/>
+            <w:r>
+              <w:rPr>
+                <w:rFonts w:ascii="Times New Roman" w:hAnsi="Times New Roman" w:eastAsia="宋体"/>
+                <w:b w:val="0"/>
+                <w:color w:val="333333"/>
+                <w:sz w:val="21"/>
+              </w:rPr>
+              <w:t>系统调用</w:t>
+            </w:r>
+          </w:p>
+        </w:tc>
+        <w:tc>
+          <w:tcPr>
+            <w:tcW w:type="dxa" w:w="2771"/>
+          </w:tcPr>
+          <w:p>
+            <w:pPr>
+              <w:jc w:val="center"/>
+            </w:pPr>
+            <w:r/>
+            <w:r>
+              <w:rPr>
+                <w:rFonts w:ascii="Times New Roman" w:hAnsi="Times New Roman" w:eastAsia="宋体"/>
+                <w:b w:val="0"/>
+                <w:color w:val="333333"/>
+                <w:sz w:val="21"/>
+              </w:rPr>
+              <w:t>北向 API</w:t>
+            </w:r>
+          </w:p>
+        </w:tc>
+        <w:tc>
+          <w:tcPr>
+            <w:tcW w:type="dxa" w:w="2771"/>
+          </w:tcPr>
+          <w:p>
+            <w:pPr>
+              <w:jc w:val="center"/>
+            </w:pPr>
+            <w:r/>
+            <w:r>
+              <w:rPr>
+                <w:rFonts w:ascii="Times New Roman" w:hAnsi="Times New Roman" w:eastAsia="宋体"/>
+                <w:b w:val="0"/>
+                <w:color w:val="333333"/>
+                <w:sz w:val="21"/>
+              </w:rPr>
+              <w:t>标准 RESTful 接口</w:t>
+            </w:r>
+          </w:p>
+        </w:tc>
+      </w:tr>
+      <w:tr>
+        <w:tc>
+          <w:tcPr>
+            <w:tcW w:type="dxa" w:w="2771"/>
+          </w:tcPr>
+          <w:p>
+            <w:pPr>
+              <w:jc w:val="center"/>
+            </w:pPr>
+            <w:r/>
+            <w:r>
+              <w:rPr>
+                <w:rFonts w:ascii="Times New Roman" w:hAnsi="Times New Roman" w:eastAsia="宋体"/>
+                <w:b w:val="0"/>
+                <w:color w:val="333333"/>
+                <w:sz w:val="21"/>
+              </w:rPr>
+              <w:t>进程调度</w:t>
+            </w:r>
+          </w:p>
+        </w:tc>
+        <w:tc>
+          <w:tcPr>
+            <w:tcW w:type="dxa" w:w="2771"/>
+          </w:tcPr>
+          <w:p>
+            <w:pPr>
+              <w:jc w:val="center"/>
+            </w:pPr>
+            <w:r/>
+            <w:r>
+              <w:rPr>
+                <w:rFonts w:ascii="Times New Roman" w:hAnsi="Times New Roman" w:eastAsia="宋体"/>
+                <w:b w:val="0"/>
+                <w:color w:val="333333"/>
+                <w:sz w:val="21"/>
+              </w:rPr>
+              <w:t>三通道分流</w:t>
+            </w:r>
+          </w:p>
+        </w:tc>
+        <w:tc>
+          <w:tcPr>
+            <w:tcW w:type="dxa" w:w="2771"/>
+          </w:tcPr>
+          <w:p>
+            <w:pPr>
+              <w:jc w:val="center"/>
+            </w:pPr>
+            <w:r/>
+            <w:r>
+              <w:rPr>
+                <w:rFonts w:ascii="Times New Roman" w:hAnsi="Times New Roman" w:eastAsia="宋体"/>
+                <w:b w:val="0"/>
+                <w:color w:val="333333"/>
+                <w:sz w:val="21"/>
+              </w:rPr>
+              <w:t>按优先级调度</w:t>
+            </w:r>
+          </w:p>
+        </w:tc>
+      </w:tr>
+    </w:tbl>
     <w:p>
       <w:pPr>
         <w:pStyle w:val="Heading2"/>
@@ -241,7 +666,7 @@
     </w:p>
     <w:p>
       <w:r>
-        <w:t>可靠 / 扩展 / AI 友好 / 实施效能……</w:t>
+        <w:t>可靠 / 扩展 / AI 友好 / 实施效能——四个硬约束决定全部技术选型。</w:t>
       </w:r>
     </w:p>
     <w:p>
@@ -254,7 +679,7 @@
     </w:p>
     <w:p>
       <w:r>
-        <w:t>三通道分流 / 不可越层 / 空间统一维度……</w:t>
+        <w:t>三通道分流 / 不可越层 / 空间统一维度。</w:t>
       </w:r>
     </w:p>
     <w:p>
@@ -267,8 +692,18 @@
     </w:p>
     <w:p>
       <w:r>
-        <w:t>每一个架构决策都对应一个可检验的非功能指标……</w:t>
+        <w:t>34 项非功能指标 → 架构决策链。</w:t>
       </w:r>
+    </w:p>
+    <w:p>
+      <w:pPr>
+        <w:sectPr>
+          <w:pgSz w:w="11906" w:h="16838"/>
+          <w:pgMar w:top="1440" w:right="1797" w:bottom="1440" w:left="1797" w:header="850" w:footer="850" w:gutter="0"/>
+          <w:cols w:space="720"/>
+          <w:docGrid w:linePitch="360"/>
+        </w:sectPr>
+      </w:pPr>
     </w:p>
     <w:p>
       <w:pPr>
@@ -286,9 +721,72 @@
         <w:t>3.1  逻辑架构（四层）</w:t>
       </w:r>
     </w:p>
+    <w:tbl>
+      <w:tblPr>
+        <w:tblW w:type="auto" w:w="0"/>
+        <w:jc w:val="center"/>
+        <w:tblLook w:firstColumn="1" w:firstRow="1" w:lastColumn="0" w:lastRow="0" w:noHBand="0" w:noVBand="1" w:val="04A0"/>
+        <w:tblBorders>
+          <w:top w:val="dashed" w:sz="6" w:space="0" w:color="999999"/>
+          <w:bottom w:val="dashed" w:sz="6" w:space="0" w:color="999999"/>
+          <w:left w:val="dashed" w:sz="6" w:space="0" w:color="999999"/>
+          <w:right w:val="dashed" w:sz="6" w:space="0" w:color="999999"/>
+        </w:tblBorders>
+      </w:tblPr>
+      <w:tblGrid>
+        <w:gridCol w:w="8312"/>
+      </w:tblGrid>
+      <w:tr>
+        <w:trPr>
+          <w:trHeight w:val="3402" w:hRule="atLeast"/>
+        </w:trPr>
+        <w:tc>
+          <w:tcPr>
+            <w:tcW w:type="dxa" w:w="8312"/>
+            <w:shd w:fill="F5F5F5" w:val="clear"/>
+          </w:tcPr>
+          <w:p>
+            <w:pPr>
+              <w:jc w:val="center"/>
+            </w:pPr>
+            <w:r/>
+            <w:r>
+              <w:rPr>
+                <w:rFonts w:ascii="Times New Roman" w:hAnsi="Times New Roman" w:eastAsia="宋体"/>
+                <w:b w:val="0"/>
+                <w:color w:val="666666"/>
+                <w:sz w:val="22"/>
+              </w:rPr>
+              <w:br/>
+              <w:br/>
+              <w:t>[ 此处插入图片：图 3-1  逻辑架构图 ]</w:t>
+              <w:br/>
+              <w:t>建议尺寸：14cm × 6cm</w:t>
+              <w:br/>
+              <w:br/>
+            </w:r>
+          </w:p>
+        </w:tc>
+      </w:tr>
+    </w:tbl>
+    <w:p>
+      <w:pPr>
+        <w:spacing w:before="60" w:after="120"/>
+        <w:jc w:val="center"/>
+      </w:pPr>
+      <w:r>
+        <w:rPr>
+          <w:rFonts w:ascii="Times New Roman" w:hAnsi="Times New Roman" w:eastAsia="宋体"/>
+          <w:b/>
+          <w:color w:val="333333"/>
+          <w:sz w:val="21"/>
+        </w:rPr>
+        <w:t>图 3-1  逻辑架构图</w:t>
+      </w:r>
+    </w:p>
     <w:p>
       <w:r>
-        <w:t>展示层 → 业务层 → 平台层 → 采集层……</w:t>
+        <w:t>展示层 → 业务层 → 平台层 → 采集层。</w:t>
       </w:r>
     </w:p>
     <w:p>
@@ -301,7 +799,7 @@
     </w:p>
     <w:p>
       <w:r>
-        <w:t>中心云 → 场站边缘 → 设备层……</w:t>
+        <w:t>中心云 → 场站边缘（安全 I/II/III 区）→ 设备层。</w:t>
       </w:r>
     </w:p>
     <w:p>
@@ -314,7 +812,7 @@
     </w:p>
     <w:p>
       <w:r>
-        <w:t>采集 → Kafka → 存储 → API……</w:t>
+        <w:t>采集 → Kafka → 存储/缓存 → API 的分层流向。</w:t>
       </w:r>
     </w:p>
     <w:p>
@@ -326,10 +824,353 @@
       </w:r>
     </w:p>
     <w:p>
+      <w:pPr>
+        <w:spacing w:before="120" w:after="60"/>
+        <w:jc w:val="center"/>
+      </w:pPr>
       <w:r>
-        <w:t>[技术选型对比表]……</w:t>
+        <w:rPr>
+          <w:rFonts w:ascii="Times New Roman" w:hAnsi="Times New Roman" w:eastAsia="宋体"/>
+          <w:b/>
+          <w:color w:val="333333"/>
+          <w:sz w:val="21"/>
+        </w:rPr>
+        <w:t>表 3-1  关键技术选型</w:t>
       </w:r>
     </w:p>
+    <w:tbl>
+      <w:tblPr>
+        <w:tblW w:type="auto" w:w="0"/>
+        <w:jc w:val="center"/>
+        <w:tblLook w:firstColumn="1" w:firstRow="1" w:lastColumn="0" w:lastRow="0" w:noHBand="0" w:noVBand="1" w:val="04A0"/>
+        <w:tblBorders>
+          <w:top w:val="single" w:sz="12" w:space="0" w:color="1B3A5C"/>
+          <w:bottom w:val="single" w:sz="12" w:space="0" w:color="1B3A5C"/>
+          <w:left w:val="single" w:sz="12" w:space="0" w:color="1B3A5C"/>
+          <w:right w:val="single" w:sz="12" w:space="0" w:color="1B3A5C"/>
+          <w:insideH w:val="single" w:sz="4" w:space="0" w:color="CCCCCC"/>
+          <w:insideV w:val="single" w:sz="4" w:space="0" w:color="CCCCCC"/>
+        </w:tblBorders>
+      </w:tblPr>
+      <w:tblGrid>
+        <w:gridCol w:w="302400"/>
+        <w:gridCol w:w="302400"/>
+        <w:gridCol w:w="302400"/>
+      </w:tblGrid>
+      <w:tr>
+        <w:tc>
+          <w:tcPr>
+            <w:tcW w:type="dxa" w:w="2771"/>
+            <w:shd w:fill="4D4D4D" w:val="clear"/>
+          </w:tcPr>
+          <w:p>
+            <w:pPr>
+              <w:jc w:val="center"/>
+            </w:pPr>
+            <w:r/>
+            <w:r>
+              <w:rPr>
+                <w:rFonts w:ascii="Times New Roman" w:hAnsi="Times New Roman" w:eastAsia="宋体"/>
+                <w:b/>
+                <w:color w:val="FFFFFF"/>
+                <w:sz w:val="21"/>
+              </w:rPr>
+              <w:t>决策域</w:t>
+            </w:r>
+          </w:p>
+        </w:tc>
+        <w:tc>
+          <w:tcPr>
+            <w:tcW w:type="dxa" w:w="2771"/>
+            <w:shd w:fill="4D4D4D" w:val="clear"/>
+          </w:tcPr>
+          <w:p>
+            <w:pPr>
+              <w:jc w:val="center"/>
+            </w:pPr>
+            <w:r/>
+            <w:r>
+              <w:rPr>
+                <w:rFonts w:ascii="Times New Roman" w:hAnsi="Times New Roman" w:eastAsia="宋体"/>
+                <w:b/>
+                <w:color w:val="FFFFFF"/>
+                <w:sz w:val="21"/>
+              </w:rPr>
+              <w:t>推荐</w:t>
+            </w:r>
+          </w:p>
+        </w:tc>
+        <w:tc>
+          <w:tcPr>
+            <w:tcW w:type="dxa" w:w="2771"/>
+            <w:shd w:fill="4D4D4D" w:val="clear"/>
+          </w:tcPr>
+          <w:p>
+            <w:pPr>
+              <w:jc w:val="center"/>
+            </w:pPr>
+            <w:r/>
+            <w:r>
+              <w:rPr>
+                <w:rFonts w:ascii="Times New Roman" w:hAnsi="Times New Roman" w:eastAsia="宋体"/>
+                <w:b/>
+                <w:color w:val="FFFFFF"/>
+                <w:sz w:val="21"/>
+              </w:rPr>
+              <w:t>备选</w:t>
+            </w:r>
+          </w:p>
+        </w:tc>
+      </w:tr>
+      <w:tr>
+        <w:tc>
+          <w:tcPr>
+            <w:tcW w:type="dxa" w:w="2771"/>
+          </w:tcPr>
+          <w:p>
+            <w:pPr>
+              <w:jc w:val="center"/>
+            </w:pPr>
+            <w:r/>
+            <w:r>
+              <w:rPr>
+                <w:rFonts w:ascii="Times New Roman" w:hAnsi="Times New Roman" w:eastAsia="宋体"/>
+                <w:b w:val="0"/>
+                <w:color w:val="333333"/>
+                <w:sz w:val="21"/>
+              </w:rPr>
+              <w:t>时序数据库</w:t>
+            </w:r>
+          </w:p>
+        </w:tc>
+        <w:tc>
+          <w:tcPr>
+            <w:tcW w:type="dxa" w:w="2771"/>
+          </w:tcPr>
+          <w:p>
+            <w:pPr>
+              <w:jc w:val="center"/>
+            </w:pPr>
+            <w:r/>
+            <w:r>
+              <w:rPr>
+                <w:rFonts w:ascii="Times New Roman" w:hAnsi="Times New Roman" w:eastAsia="宋体"/>
+                <w:b w:val="0"/>
+                <w:color w:val="333333"/>
+                <w:sz w:val="21"/>
+              </w:rPr>
+              <w:t>ClickHouse</w:t>
+            </w:r>
+          </w:p>
+        </w:tc>
+        <w:tc>
+          <w:tcPr>
+            <w:tcW w:type="dxa" w:w="2771"/>
+          </w:tcPr>
+          <w:p>
+            <w:pPr>
+              <w:jc w:val="center"/>
+            </w:pPr>
+            <w:r/>
+            <w:r>
+              <w:rPr>
+                <w:rFonts w:ascii="Times New Roman" w:hAnsi="Times New Roman" w:eastAsia="宋体"/>
+                <w:b w:val="0"/>
+                <w:color w:val="333333"/>
+                <w:sz w:val="21"/>
+              </w:rPr>
+              <w:t>TDengine/DolphinDB</w:t>
+            </w:r>
+          </w:p>
+        </w:tc>
+      </w:tr>
+      <w:tr>
+        <w:tc>
+          <w:tcPr>
+            <w:tcW w:type="dxa" w:w="2771"/>
+          </w:tcPr>
+          <w:p>
+            <w:pPr>
+              <w:jc w:val="center"/>
+            </w:pPr>
+            <w:r/>
+            <w:r>
+              <w:rPr>
+                <w:rFonts w:ascii="Times New Roman" w:hAnsi="Times New Roman" w:eastAsia="宋体"/>
+                <w:b w:val="0"/>
+                <w:color w:val="333333"/>
+                <w:sz w:val="21"/>
+              </w:rPr>
+              <w:t>业务数据库</w:t>
+            </w:r>
+          </w:p>
+        </w:tc>
+        <w:tc>
+          <w:tcPr>
+            <w:tcW w:type="dxa" w:w="2771"/>
+          </w:tcPr>
+          <w:p>
+            <w:pPr>
+              <w:jc w:val="center"/>
+            </w:pPr>
+            <w:r/>
+            <w:r>
+              <w:rPr>
+                <w:rFonts w:ascii="Times New Roman" w:hAnsi="Times New Roman" w:eastAsia="宋体"/>
+                <w:b w:val="0"/>
+                <w:color w:val="333333"/>
+                <w:sz w:val="21"/>
+              </w:rPr>
+              <w:t>Postgres+PostGIS</w:t>
+            </w:r>
+          </w:p>
+        </w:tc>
+        <w:tc>
+          <w:tcPr>
+            <w:tcW w:type="dxa" w:w="2771"/>
+          </w:tcPr>
+          <w:p>
+            <w:pPr>
+              <w:jc w:val="center"/>
+            </w:pPr>
+            <w:r/>
+            <w:r>
+              <w:rPr>
+                <w:rFonts w:ascii="Times New Roman" w:hAnsi="Times New Roman" w:eastAsia="宋体"/>
+                <w:b w:val="0"/>
+                <w:color w:val="333333"/>
+                <w:sz w:val="21"/>
+              </w:rPr>
+              <w:t>达梦 DM8</w:t>
+            </w:r>
+          </w:p>
+        </w:tc>
+      </w:tr>
+      <w:tr>
+        <w:tc>
+          <w:tcPr>
+            <w:tcW w:type="dxa" w:w="2771"/>
+          </w:tcPr>
+          <w:p>
+            <w:pPr>
+              <w:jc w:val="center"/>
+            </w:pPr>
+            <w:r/>
+            <w:r>
+              <w:rPr>
+                <w:rFonts w:ascii="Times New Roman" w:hAnsi="Times New Roman" w:eastAsia="宋体"/>
+                <w:b w:val="0"/>
+                <w:color w:val="333333"/>
+                <w:sz w:val="21"/>
+              </w:rPr>
+              <w:t>消息队列</w:t>
+            </w:r>
+          </w:p>
+        </w:tc>
+        <w:tc>
+          <w:tcPr>
+            <w:tcW w:type="dxa" w:w="2771"/>
+          </w:tcPr>
+          <w:p>
+            <w:pPr>
+              <w:jc w:val="center"/>
+            </w:pPr>
+            <w:r/>
+            <w:r>
+              <w:rPr>
+                <w:rFonts w:ascii="Times New Roman" w:hAnsi="Times New Roman" w:eastAsia="宋体"/>
+                <w:b w:val="0"/>
+                <w:color w:val="333333"/>
+                <w:sz w:val="21"/>
+              </w:rPr>
+              <w:t>Kafka</w:t>
+            </w:r>
+          </w:p>
+        </w:tc>
+        <w:tc>
+          <w:tcPr>
+            <w:tcW w:type="dxa" w:w="2771"/>
+          </w:tcPr>
+          <w:p>
+            <w:pPr>
+              <w:jc w:val="center"/>
+            </w:pPr>
+            <w:r/>
+            <w:r>
+              <w:rPr>
+                <w:rFonts w:ascii="Times New Roman" w:hAnsi="Times New Roman" w:eastAsia="宋体"/>
+                <w:b w:val="0"/>
+                <w:color w:val="333333"/>
+                <w:sz w:val="21"/>
+              </w:rPr>
+              <w:t>RocketMQ</w:t>
+            </w:r>
+          </w:p>
+        </w:tc>
+      </w:tr>
+      <w:tr>
+        <w:tc>
+          <w:tcPr>
+            <w:tcW w:type="dxa" w:w="2771"/>
+          </w:tcPr>
+          <w:p>
+            <w:pPr>
+              <w:jc w:val="center"/>
+            </w:pPr>
+            <w:r/>
+            <w:r>
+              <w:rPr>
+                <w:rFonts w:ascii="Times New Roman" w:hAnsi="Times New Roman" w:eastAsia="宋体"/>
+                <w:b w:val="0"/>
+                <w:color w:val="333333"/>
+                <w:sz w:val="21"/>
+              </w:rPr>
+              <w:t>三维引擎</w:t>
+            </w:r>
+          </w:p>
+        </w:tc>
+        <w:tc>
+          <w:tcPr>
+            <w:tcW w:type="dxa" w:w="2771"/>
+          </w:tcPr>
+          <w:p>
+            <w:pPr>
+              <w:jc w:val="center"/>
+            </w:pPr>
+            <w:r/>
+            <w:r>
+              <w:rPr>
+                <w:rFonts w:ascii="Times New Roman" w:hAnsi="Times New Roman" w:eastAsia="宋体"/>
+                <w:b w:val="0"/>
+                <w:color w:val="333333"/>
+                <w:sz w:val="21"/>
+              </w:rPr>
+              <w:t>Cesium+Three.js</w:t>
+            </w:r>
+          </w:p>
+        </w:tc>
+        <w:tc>
+          <w:tcPr>
+            <w:tcW w:type="dxa" w:w="2771"/>
+          </w:tcPr>
+          <w:p>
+            <w:pPr>
+              <w:jc w:val="center"/>
+            </w:pPr>
+            <w:r/>
+            <w:r>
+              <w:rPr>
+                <w:rFonts w:ascii="Times New Roman" w:hAnsi="Times New Roman" w:eastAsia="宋体"/>
+                <w:b w:val="0"/>
+                <w:color w:val="333333"/>
+                <w:sz w:val="21"/>
+              </w:rPr>
+              <w:t>待定</w:t>
+            </w:r>
+          </w:p>
+        </w:tc>
+      </w:tr>
+    </w:tbl>
     <w:p>
       <w:pPr>
         <w:pStyle w:val="Heading2"/>
@@ -340,15 +1181,25 @@
     </w:p>
     <w:p>
       <w:r>
-        <w:t>边缘推理 + 云端训练 + 人机协同……</w:t>
+        <w:t>边缘推理（场站 II 区 GPU）+ 云端训练（中心云 GPU 集群）+ 人机协同闭环。</w:t>
       </w:r>
+    </w:p>
+    <w:p>
+      <w:pPr>
+        <w:sectPr>
+          <w:pgSz w:w="11906" w:h="16838"/>
+          <w:pgMar w:top="1440" w:right="1797" w:bottom="1440" w:left="1797" w:header="850" w:footer="850" w:gutter="0"/>
+          <w:cols w:space="720"/>
+          <w:docGrid w:linePitch="360"/>
+        </w:sectPr>
+      </w:pPr>
     </w:p>
     <w:p>
       <w:pPr>
         <w:pStyle w:val="Heading1"/>
       </w:pPr>
       <w:r>
-        <w:t>第四章  业务子系统方案</w:t>
+        <w:t>第四章  业务子系统方案（概要）</w:t>
       </w:r>
     </w:p>
     <w:p>
@@ -400,7 +1251,7 @@
     </w:p>
     <w:p>
       <w:r>
-        <w:t>升压站巡视 / 光伏运维 / 输电线路 / 储能安全……</w:t>
+        <w:t>升压站巡视 / 光伏运维 / 储能安全……</w:t>
       </w:r>
     </w:p>
     <w:p>
@@ -413,8 +1264,18 @@
     </w:p>
     <w:p>
       <w:r>
-        <w:t>360°监控 / AI诊断 / 运维门户 / 生产运营……</w:t>
+        <w:t>实时监控 / AI 诊断 / 运维门户……</w:t>
       </w:r>
+    </w:p>
+    <w:p>
+      <w:pPr>
+        <w:sectPr>
+          <w:pgSz w:w="11906" w:h="16838"/>
+          <w:pgMar w:top="1440" w:right="1797" w:bottom="1440" w:left="1797" w:header="850" w:footer="850" w:gutter="0"/>
+          <w:cols w:space="720"/>
+          <w:docGrid w:linePitch="360"/>
+        </w:sectPr>
+      </w:pPr>
     </w:p>
     <w:p>
       <w:pPr>
@@ -434,7 +1295,7 @@
     </w:p>
     <w:p>
       <w:r>
-        <w:t>34 项指标逐项承诺值 + 分层 SLA……</w:t>
+        <w:t>34 项指标逐项承诺值 + 分层 SLA。</w:t>
       </w:r>
     </w:p>
     <w:p>
@@ -447,7 +1308,7 @@
     </w:p>
     <w:p>
       <w:r>
-        <w:t>MTBF ≥10000h 的架构保障……</w:t>
+        <w:t>MTBF ≥10000h / N+1 冗余 / 故障自动切换。</w:t>
       </w:r>
     </w:p>
     <w:p>
@@ -460,7 +1321,7 @@
     </w:p>
     <w:p>
       <w:r>
-        <w:t>等保二级 + 电力二次安防……</w:t>
+        <w:t>等保二级 + 电力二次安防（I/II/III 区隔离）。</w:t>
       </w:r>
     </w:p>
     <w:p>
@@ -473,7 +1334,7 @@
     </w:p>
     <w:p>
       <w:r>
-        <w:t>多场站统一调度 / 功能模块可插拔……</w:t>
+        <w:t>多场站统一调度 / 功能模块可插拔 / 低代码建模。</w:t>
       </w:r>
     </w:p>
     <w:p>
@@ -485,13 +1346,292 @@
       </w:r>
     </w:p>
     <w:p>
+      <w:pPr>
+        <w:spacing w:before="120" w:after="60"/>
+        <w:jc w:val="center"/>
+      </w:pPr>
       <w:r>
-        <w:t>4 个月三阶段交付……</w:t>
+        <w:rPr>
+          <w:rFonts w:ascii="Times New Roman" w:hAnsi="Times New Roman" w:eastAsia="宋体"/>
+          <w:b/>
+          <w:color w:val="333333"/>
+          <w:sz w:val="21"/>
+        </w:rPr>
+        <w:t>表 5-1  项目实施计划</w:t>
       </w:r>
     </w:p>
+    <w:tbl>
+      <w:tblPr>
+        <w:tblW w:type="auto" w:w="0"/>
+        <w:jc w:val="center"/>
+        <w:tblLook w:firstColumn="1" w:firstRow="1" w:lastColumn="0" w:lastRow="0" w:noHBand="0" w:noVBand="1" w:val="04A0"/>
+        <w:tblBorders>
+          <w:top w:val="single" w:sz="12" w:space="0" w:color="1B3A5C"/>
+          <w:bottom w:val="single" w:sz="12" w:space="0" w:color="1B3A5C"/>
+          <w:left w:val="single" w:sz="12" w:space="0" w:color="1B3A5C"/>
+          <w:right w:val="single" w:sz="12" w:space="0" w:color="1B3A5C"/>
+          <w:insideH w:val="single" w:sz="4" w:space="0" w:color="CCCCCC"/>
+          <w:insideV w:val="single" w:sz="4" w:space="0" w:color="CCCCCC"/>
+        </w:tblBorders>
+      </w:tblPr>
+      <w:tblGrid>
+        <w:gridCol w:w="302400"/>
+        <w:gridCol w:w="302400"/>
+        <w:gridCol w:w="302400"/>
+      </w:tblGrid>
+      <w:tr>
+        <w:tc>
+          <w:tcPr>
+            <w:tcW w:type="dxa" w:w="2771"/>
+            <w:shd w:fill="4D4D4D" w:val="clear"/>
+          </w:tcPr>
+          <w:p>
+            <w:pPr>
+              <w:jc w:val="center"/>
+            </w:pPr>
+            <w:r/>
+            <w:r>
+              <w:rPr>
+                <w:rFonts w:ascii="Times New Roman" w:hAnsi="Times New Roman" w:eastAsia="宋体"/>
+                <w:b/>
+                <w:color w:val="FFFFFF"/>
+                <w:sz w:val="21"/>
+              </w:rPr>
+              <w:t>阶段</w:t>
+            </w:r>
+          </w:p>
+        </w:tc>
+        <w:tc>
+          <w:tcPr>
+            <w:tcW w:type="dxa" w:w="2771"/>
+            <w:shd w:fill="4D4D4D" w:val="clear"/>
+          </w:tcPr>
+          <w:p>
+            <w:pPr>
+              <w:jc w:val="center"/>
+            </w:pPr>
+            <w:r/>
+            <w:r>
+              <w:rPr>
+                <w:rFonts w:ascii="Times New Roman" w:hAnsi="Times New Roman" w:eastAsia="宋体"/>
+                <w:b/>
+                <w:color w:val="FFFFFF"/>
+                <w:sz w:val="21"/>
+              </w:rPr>
+              <w:t>周期</w:t>
+            </w:r>
+          </w:p>
+        </w:tc>
+        <w:tc>
+          <w:tcPr>
+            <w:tcW w:type="dxa" w:w="2771"/>
+            <w:shd w:fill="4D4D4D" w:val="clear"/>
+          </w:tcPr>
+          <w:p>
+            <w:pPr>
+              <w:jc w:val="center"/>
+            </w:pPr>
+            <w:r/>
+            <w:r>
+              <w:rPr>
+                <w:rFonts w:ascii="Times New Roman" w:hAnsi="Times New Roman" w:eastAsia="宋体"/>
+                <w:b/>
+                <w:color w:val="FFFFFF"/>
+                <w:sz w:val="21"/>
+              </w:rPr>
+              <w:t>交付内容</w:t>
+            </w:r>
+          </w:p>
+        </w:tc>
+      </w:tr>
+      <w:tr>
+        <w:tc>
+          <w:tcPr>
+            <w:tcW w:type="dxa" w:w="2771"/>
+          </w:tcPr>
+          <w:p>
+            <w:pPr>
+              <w:jc w:val="center"/>
+            </w:pPr>
+            <w:r/>
+            <w:r>
+              <w:rPr>
+                <w:rFonts w:ascii="Times New Roman" w:hAnsi="Times New Roman" w:eastAsia="宋体"/>
+                <w:b w:val="0"/>
+                <w:color w:val="333333"/>
+                <w:sz w:val="21"/>
+              </w:rPr>
+              <w:t>一阶段</w:t>
+            </w:r>
+          </w:p>
+        </w:tc>
+        <w:tc>
+          <w:tcPr>
+            <w:tcW w:type="dxa" w:w="2771"/>
+          </w:tcPr>
+          <w:p>
+            <w:pPr>
+              <w:jc w:val="center"/>
+            </w:pPr>
+            <w:r/>
+            <w:r>
+              <w:rPr>
+                <w:rFonts w:ascii="Times New Roman" w:hAnsi="Times New Roman" w:eastAsia="宋体"/>
+                <w:b w:val="0"/>
+                <w:color w:val="333333"/>
+                <w:sz w:val="21"/>
+              </w:rPr>
+              <w:t>第 1-2 月</w:t>
+            </w:r>
+          </w:p>
+        </w:tc>
+        <w:tc>
+          <w:tcPr>
+            <w:tcW w:type="dxa" w:w="2771"/>
+          </w:tcPr>
+          <w:p>
+            <w:pPr>
+              <w:jc w:val="center"/>
+            </w:pPr>
+            <w:r/>
+            <w:r>
+              <w:rPr>
+                <w:rFonts w:ascii="Times New Roman" w:hAnsi="Times New Roman" w:eastAsia="宋体"/>
+                <w:b w:val="0"/>
+                <w:color w:val="333333"/>
+                <w:sz w:val="21"/>
+              </w:rPr>
+              <w:t>平台底座（F1）+ 实时监控</w:t>
+            </w:r>
+          </w:p>
+        </w:tc>
+      </w:tr>
+      <w:tr>
+        <w:tc>
+          <w:tcPr>
+            <w:tcW w:type="dxa" w:w="2771"/>
+          </w:tcPr>
+          <w:p>
+            <w:pPr>
+              <w:jc w:val="center"/>
+            </w:pPr>
+            <w:r/>
+            <w:r>
+              <w:rPr>
+                <w:rFonts w:ascii="Times New Roman" w:hAnsi="Times New Roman" w:eastAsia="宋体"/>
+                <w:b w:val="0"/>
+                <w:color w:val="333333"/>
+                <w:sz w:val="21"/>
+              </w:rPr>
+              <w:t>二阶段</w:t>
+            </w:r>
+          </w:p>
+        </w:tc>
+        <w:tc>
+          <w:tcPr>
+            <w:tcW w:type="dxa" w:w="2771"/>
+          </w:tcPr>
+          <w:p>
+            <w:pPr>
+              <w:jc w:val="center"/>
+            </w:pPr>
+            <w:r/>
+            <w:r>
+              <w:rPr>
+                <w:rFonts w:ascii="Times New Roman" w:hAnsi="Times New Roman" w:eastAsia="宋体"/>
+                <w:b w:val="0"/>
+                <w:color w:val="333333"/>
+                <w:sz w:val="21"/>
+              </w:rPr>
+              <w:t>第 2-3 月</w:t>
+            </w:r>
+          </w:p>
+        </w:tc>
+        <w:tc>
+          <w:tcPr>
+            <w:tcW w:type="dxa" w:w="2771"/>
+          </w:tcPr>
+          <w:p>
+            <w:pPr>
+              <w:jc w:val="center"/>
+            </w:pPr>
+            <w:r/>
+            <w:r>
+              <w:rPr>
+                <w:rFonts w:ascii="Times New Roman" w:hAnsi="Times New Roman" w:eastAsia="宋体"/>
+                <w:b w:val="0"/>
+                <w:color w:val="333333"/>
+                <w:sz w:val="21"/>
+              </w:rPr>
+              <w:t>核心业务（F2/F3/F4 核心模块）</w:t>
+            </w:r>
+          </w:p>
+        </w:tc>
+      </w:tr>
+      <w:tr>
+        <w:tc>
+          <w:tcPr>
+            <w:tcW w:type="dxa" w:w="2771"/>
+          </w:tcPr>
+          <w:p>
+            <w:pPr>
+              <w:jc w:val="center"/>
+            </w:pPr>
+            <w:r/>
+            <w:r>
+              <w:rPr>
+                <w:rFonts w:ascii="Times New Roman" w:hAnsi="Times New Roman" w:eastAsia="宋体"/>
+                <w:b w:val="0"/>
+                <w:color w:val="333333"/>
+                <w:sz w:val="21"/>
+              </w:rPr>
+              <w:t>三阶段</w:t>
+            </w:r>
+          </w:p>
+        </w:tc>
+        <w:tc>
+          <w:tcPr>
+            <w:tcW w:type="dxa" w:w="2771"/>
+          </w:tcPr>
+          <w:p>
+            <w:pPr>
+              <w:jc w:val="center"/>
+            </w:pPr>
+            <w:r/>
+            <w:r>
+              <w:rPr>
+                <w:rFonts w:ascii="Times New Roman" w:hAnsi="Times New Roman" w:eastAsia="宋体"/>
+                <w:b w:val="0"/>
+                <w:color w:val="333333"/>
+                <w:sz w:val="21"/>
+              </w:rPr>
+              <w:t>第 3-4 月</w:t>
+            </w:r>
+          </w:p>
+        </w:tc>
+        <w:tc>
+          <w:tcPr>
+            <w:tcW w:type="dxa" w:w="2771"/>
+          </w:tcPr>
+          <w:p>
+            <w:pPr>
+              <w:jc w:val="center"/>
+            </w:pPr>
+            <w:r/>
+            <w:r>
+              <w:rPr>
+                <w:rFonts w:ascii="Times New Roman" w:hAnsi="Times New Roman" w:eastAsia="宋体"/>
+                <w:b w:val="0"/>
+                <w:color w:val="333333"/>
+                <w:sz w:val="21"/>
+              </w:rPr>
+              <w:t>增强功能 + 联调测试 + 上线验收</w:t>
+            </w:r>
+          </w:p>
+        </w:tc>
+      </w:tr>
+    </w:tbl>
     <w:sectPr>
-      <w:headerReference w:type="default" r:id="rId9"/>
-      <w:footerReference w:type="default" r:id="rId10"/>
       <w:pgSz w:w="11906" w:h="16838"/>
       <w:pgMar w:top="1440" w:right="1797" w:bottom="1440" w:left="1797" w:header="850" w:footer="850" w:gutter="0"/>
       <w:cols w:space="720"/>
@@ -506,6 +1646,16 @@
   <w:p>
     <w:pPr>
       <w:pStyle w:val="Footer"/>
+    </w:pPr>
+  </w:p>
+</w:ftr>
+</file>
+
+<file path=word/footer2.xml><?xml version="1.0" encoding="utf-8"?>
+<w:ftr xmlns:m="http://schemas.openxmlformats.org/officeDocument/2006/math" xmlns:mc="http://schemas.openxmlformats.org/markup-compatibility/2006" xmlns:mo="http://schemas.microsoft.com/office/mac/office/2008/main" xmlns:mv="urn:schemas-microsoft-com:mac:vml" xmlns:o="urn:schemas-microsoft-com:office:office" xmlns:r="http://schemas.openxmlformats.org/officeDocument/2006/relationships" xmlns:v="urn:schemas-microsoft-com:vml" xmlns:w10="urn:schemas-microsoft-com:office:word" xmlns:w14="http://schemas.microsoft.com/office/word/2010/wordml" xmlns:w="http://schemas.openxmlformats.org/wordprocessingml/2006/main" xmlns:wne="http://schemas.microsoft.com/office/word/2006/wordml" xmlns:wp14="http://schemas.microsoft.com/office/word/2010/wordprocessingDrawing" xmlns:wp="http://schemas.openxmlformats.org/drawingml/2006/wordprocessingDrawing" xmlns:wpc="http://schemas.microsoft.com/office/word/2010/wordprocessingCanvas" xmlns:wpg="http://schemas.microsoft.com/office/word/2010/wordprocessingGroup" xmlns:wpi="http://schemas.microsoft.com/office/word/2010/wordprocessingInk" xmlns:wps="http://schemas.microsoft.com/office/word/2010/wordprocessingShape" mc:Ignorable="w14 wp14">
+  <w:p>
+    <w:pPr>
+      <w:pStyle w:val="Footer"/>
       <w:jc w:val="center"/>
     </w:pPr>
     <w:r>
@@ -540,6 +1690,16 @@
 </file>
 
 <file path=word/header1.xml><?xml version="1.0" encoding="utf-8"?>
+<w:hdr xmlns:m="http://schemas.openxmlformats.org/officeDocument/2006/math" xmlns:mc="http://schemas.openxmlformats.org/markup-compatibility/2006" xmlns:mo="http://schemas.microsoft.com/office/mac/office/2008/main" xmlns:mv="urn:schemas-microsoft-com:mac:vml" xmlns:o="urn:schemas-microsoft-com:office:office" xmlns:r="http://schemas.openxmlformats.org/officeDocument/2006/relationships" xmlns:v="urn:schemas-microsoft-com:vml" xmlns:w10="urn:schemas-microsoft-com:office:word" xmlns:w14="http://schemas.microsoft.com/office/word/2010/wordml" xmlns:w="http://schemas.openxmlformats.org/wordprocessingml/2006/main" xmlns:wne="http://schemas.microsoft.com/office/word/2006/wordml" xmlns:wp14="http://schemas.microsoft.com/office/word/2010/wordprocessingDrawing" xmlns:wp="http://schemas.openxmlformats.org/drawingml/2006/wordprocessingDrawing" xmlns:wpc="http://schemas.microsoft.com/office/word/2010/wordprocessingCanvas" xmlns:wpg="http://schemas.microsoft.com/office/word/2010/wordprocessingGroup" xmlns:wpi="http://schemas.microsoft.com/office/word/2010/wordprocessingInk" xmlns:wps="http://schemas.microsoft.com/office/word/2010/wordprocessingShape" mc:Ignorable="w14 wp14">
+  <w:p>
+    <w:pPr>
+      <w:pStyle w:val="Header"/>
+    </w:pPr>
+  </w:p>
+</w:hdr>
+</file>
+
+<file path=word/header2.xml><?xml version="1.0" encoding="utf-8"?>
 <w:hdr xmlns:m="http://schemas.openxmlformats.org/officeDocument/2006/math" xmlns:mc="http://schemas.openxmlformats.org/markup-compatibility/2006" xmlns:mo="http://schemas.microsoft.com/office/mac/office/2008/main" xmlns:mv="urn:schemas-microsoft-com:mac:vml" xmlns:o="urn:schemas-microsoft-com:office:office" xmlns:r="http://schemas.openxmlformats.org/officeDocument/2006/relationships" xmlns:v="urn:schemas-microsoft-com:vml" xmlns:w10="urn:schemas-microsoft-com:office:word" xmlns:w14="http://schemas.microsoft.com/office/word/2010/wordml" xmlns:w="http://schemas.openxmlformats.org/wordprocessingml/2006/main" xmlns:wne="http://schemas.microsoft.com/office/word/2006/wordml" xmlns:wp14="http://schemas.microsoft.com/office/word/2010/wordprocessingDrawing" xmlns:wp="http://schemas.openxmlformats.org/drawingml/2006/wordprocessingDrawing" xmlns:wpc="http://schemas.microsoft.com/office/word/2010/wordprocessingCanvas" xmlns:wpg="http://schemas.microsoft.com/office/word/2010/wordprocessingGroup" xmlns:wpi="http://schemas.microsoft.com/office/word/2010/wordprocessingInk" xmlns:wps="http://schemas.microsoft.com/office/word/2010/wordprocessingShape" mc:Ignorable="w14 wp14">
   <w:p>
     <w:pPr>
@@ -988,7 +2148,7 @@
     <w:pPr>
       <w:keepNext/>
       <w:keepLines/>
-      <w:spacing w:before="360" w:after="240" w:line="360" w:lineRule="auto"/>
+      <w:spacing w:before="240" w:after="240" w:line="360" w:lineRule="auto"/>
       <w:ind w:firstLine="0"/>
       <w:outlineLvl w:val="0"/>
     </w:pPr>

</xml_diff>